<commit_message>
feat: EGFR 18-21模板 增加位点EGFR	C797S 检出
</commit_message>
<xml_diff>
--- a/WebContent/docx/EGFR_18-21外显子基因检测报告模板-盖章版.docx
+++ b/WebContent/docx/EGFR_18-21外显子基因检测报告模板-盖章版.docx
@@ -3224,6 +3224,203 @@
             </w:pPr>
             <w:r>
               <w:rPr>
+                <w:rFonts w:ascii="Times New Roman" w:hAnsi="Times New Roman" w:eastAsia="微软雅黑" w:cs="微软雅黑"/>
+                <w:sz w:val="28"/>
+                <w:szCs w:val="28"/>
+              </w:rPr>
+              <w:t>C797S</w:t>
+            </w:r>
+          </w:p>
+        </w:tc>
+        <w:tc>
+          <w:tcPr>
+            <w:tcW w:w="622" w:type="pct"/>
+            <w:tcBorders>
+              <w:tl2br w:val="nil"/>
+              <w:tr2bl w:val="nil"/>
+            </w:tcBorders>
+            <w:vAlign w:val="center"/>
+          </w:tcPr>
+          <w:p>
+            <w:pPr>
+              <w:adjustRightInd w:val="0"/>
+              <w:snapToGrid w:val="0"/>
+              <w:spacing w:after="0" w:line="240" w:lineRule="auto"/>
+              <w:jc w:val="center"/>
+              <w:rPr>
+                <w:rFonts w:hint="default" w:ascii="Times New Roman" w:hAnsi="Times New Roman" w:eastAsia="微软雅黑" w:cs="微软雅黑"/>
+                <w:sz w:val="28"/>
+                <w:szCs w:val="28"/>
+                <w:lang w:val="en-US" w:eastAsia="zh-CN"/>
+              </w:rPr>
+            </w:pPr>
+            <w:r>
+              <w:rPr>
+                <w:rFonts w:hint="eastAsia" w:ascii="Times New Roman" w:hAnsi="Times New Roman" w:eastAsia="微软雅黑" w:cs="微软雅黑"/>
+                <w:sz w:val="28"/>
+                <w:szCs w:val="28"/>
+                <w:lang w:val="en-US" w:eastAsia="zh-CN"/>
+              </w:rPr>
+              <w:t>20</w:t>
+            </w:r>
+          </w:p>
+        </w:tc>
+        <w:tc>
+          <w:tcPr>
+            <w:tcW w:w="3066" w:type="pct"/>
+            <w:tcBorders>
+              <w:tl2br w:val="nil"/>
+              <w:tr2bl w:val="nil"/>
+            </w:tcBorders>
+            <w:vAlign w:val="center"/>
+          </w:tcPr>
+          <w:p>
+            <w:pPr>
+              <w:adjustRightInd w:val="0"/>
+              <w:snapToGrid w:val="0"/>
+              <w:spacing w:after="0" w:line="240" w:lineRule="auto"/>
+              <w:jc w:val="both"/>
+              <w:rPr>
+                <w:rFonts w:hint="eastAsia" w:ascii="Times New Roman" w:hAnsi="Times New Roman" w:eastAsia="微软雅黑" w:cs="微软雅黑"/>
+                <w:sz w:val="28"/>
+                <w:szCs w:val="28"/>
+              </w:rPr>
+            </w:pPr>
+            <w:r>
+              <w:rPr>
+                <w:rFonts w:hint="eastAsia" w:ascii="Times New Roman" w:hAnsi="Times New Roman" w:eastAsia="微软雅黑" w:cs="微软雅黑"/>
+                <w:sz w:val="28"/>
+                <w:szCs w:val="28"/>
+              </w:rPr>
+              <w:t xml:space="preserve">{{ </w:t>
+            </w:r>
+            <w:r>
+              <w:rPr>
+                <w:rFonts w:ascii="Times New Roman" w:hAnsi="Times New Roman" w:eastAsia="微软雅黑" w:cs="微软雅黑"/>
+                <w:sz w:val="28"/>
+                <w:szCs w:val="28"/>
+              </w:rPr>
+              <w:t>“</w:t>
+            </w:r>
+            <w:r>
+              <w:rPr>
+                <w:rFonts w:hint="eastAsia" w:ascii="Times New Roman" w:hAnsi="Times New Roman" w:eastAsia="微软雅黑" w:cs="微软雅黑"/>
+                <w:sz w:val="28"/>
+                <w:szCs w:val="28"/>
+              </w:rPr>
+              <w:t xml:space="preserve">EGFR </w:t>
+            </w:r>
+            <w:r>
+              <w:rPr>
+                <w:rFonts w:ascii="Times New Roman" w:hAnsi="Times New Roman" w:eastAsia="微软雅黑" w:cs="微软雅黑"/>
+                <w:sz w:val="28"/>
+                <w:szCs w:val="28"/>
+              </w:rPr>
+              <w:t>C797S”</w:t>
+            </w:r>
+            <w:r>
+              <w:rPr>
+                <w:rFonts w:hint="eastAsia" w:ascii="Times New Roman" w:hAnsi="Times New Roman" w:eastAsia="微软雅黑" w:cs="微软雅黑"/>
+                <w:sz w:val="28"/>
+                <w:szCs w:val="28"/>
+              </w:rPr>
+              <w:t xml:space="preserve"> | </w:t>
+            </w:r>
+            <w:r>
+              <w:rPr>
+                <w:rFonts w:ascii="Times New Roman" w:hAnsi="Times New Roman" w:eastAsia="微软雅黑" w:cs="微软雅黑"/>
+                <w:sz w:val="28"/>
+                <w:szCs w:val="28"/>
+              </w:rPr>
+              <w:t>detectionMutation</w:t>
+            </w:r>
+            <w:r>
+              <w:rPr>
+                <w:rFonts w:hint="eastAsia" w:ascii="Times New Roman" w:hAnsi="Times New Roman" w:eastAsia="微软雅黑" w:cs="微软雅黑"/>
+                <w:sz w:val="28"/>
+                <w:szCs w:val="28"/>
+              </w:rPr>
+              <w:t>() }}</w:t>
+            </w:r>
+          </w:p>
+        </w:tc>
+      </w:tr>
+      <w:tr>
+        <w:tblPrEx>
+          <w:tblBorders>
+            <w:top w:val="none" w:color="auto" w:sz="0" w:space="0"/>
+            <w:left w:val="none" w:color="auto" w:sz="0" w:space="0"/>
+            <w:bottom w:val="none" w:color="auto" w:sz="0" w:space="0"/>
+            <w:right w:val="none" w:color="auto" w:sz="0" w:space="0"/>
+            <w:insideH w:val="none" w:color="auto" w:sz="0" w:space="0"/>
+            <w:insideV w:val="none" w:color="auto" w:sz="0" w:space="0"/>
+          </w:tblBorders>
+          <w:tblCellMar>
+            <w:top w:w="0" w:type="dxa"/>
+            <w:left w:w="108" w:type="dxa"/>
+            <w:bottom w:w="0" w:type="dxa"/>
+            <w:right w:w="108" w:type="dxa"/>
+          </w:tblCellMar>
+        </w:tblPrEx>
+        <w:trPr>
+          <w:cantSplit/>
+          <w:trHeight w:val="420" w:hRule="atLeast"/>
+          <w:jc w:val="center"/>
+        </w:trPr>
+        <w:tc>
+          <w:tcPr>
+            <w:tcW w:w="476" w:type="pct"/>
+            <w:tcBorders>
+              <w:tl2br w:val="nil"/>
+              <w:tr2bl w:val="nil"/>
+            </w:tcBorders>
+            <w:vAlign w:val="center"/>
+          </w:tcPr>
+          <w:p>
+            <w:pPr>
+              <w:adjustRightInd w:val="0"/>
+              <w:snapToGrid w:val="0"/>
+              <w:spacing w:after="0" w:line="240" w:lineRule="auto"/>
+              <w:jc w:val="both"/>
+              <w:rPr>
+                <w:rFonts w:ascii="Times New Roman" w:hAnsi="Times New Roman" w:eastAsia="微软雅黑" w:cs="微软雅黑"/>
+                <w:sz w:val="28"/>
+                <w:szCs w:val="28"/>
+              </w:rPr>
+            </w:pPr>
+            <w:r>
+              <w:rPr>
+                <w:rFonts w:ascii="Times New Roman" w:hAnsi="Times New Roman" w:eastAsia="微软雅黑" w:cs="微软雅黑"/>
+                <w:sz w:val="28"/>
+                <w:szCs w:val="28"/>
+              </w:rPr>
+              <w:t>EGFR</w:t>
+            </w:r>
+          </w:p>
+        </w:tc>
+        <w:tc>
+          <w:tcPr>
+            <w:tcW w:w="835" w:type="pct"/>
+            <w:tcBorders>
+              <w:tl2br w:val="nil"/>
+              <w:tr2bl w:val="nil"/>
+            </w:tcBorders>
+            <w:vAlign w:val="center"/>
+          </w:tcPr>
+          <w:p>
+            <w:pPr>
+              <w:adjustRightInd w:val="0"/>
+              <w:snapToGrid w:val="0"/>
+              <w:spacing w:after="0" w:line="240" w:lineRule="auto"/>
+              <w:jc w:val="both"/>
+              <w:rPr>
+                <w:rFonts w:ascii="Times New Roman" w:hAnsi="Times New Roman" w:eastAsia="微软雅黑" w:cs="微软雅黑"/>
+                <w:sz w:val="28"/>
+                <w:szCs w:val="28"/>
+              </w:rPr>
+            </w:pPr>
+            <w:r>
+              <w:rPr>
                 <w:rFonts w:hint="eastAsia" w:ascii="Times New Roman" w:hAnsi="Times New Roman" w:eastAsia="微软雅黑" w:cs="微软雅黑"/>
                 <w:sz w:val="28"/>
                 <w:szCs w:val="28"/>
@@ -3653,7 +3850,7 @@
                 </mc:Choice>
                 <mc:Fallback>
                   <w:pict>
-                    <v:group id="_x0000_s1026" o:spid="_x0000_s1026" o:spt="203" style="position:absolute;left:0pt;margin-left:0.6pt;margin-top:-37.8pt;height:113.6pt;width:240.8pt;z-index:251664384;mso-width-relative:page;mso-height-relative:page;" coordorigin="19211,18842" coordsize="4816,2272" o:gfxdata="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">
+                    <v:group id="_x0000_s1026" o:spid="_x0000_s1026" o:spt="203" style="position:absolute;left:0pt;margin-left:0.6pt;margin-top:-37.8pt;height:113.6pt;width:240.8pt;z-index:251664384;mso-width-relative:page;mso-height-relative:page;" coordorigin="19211,18842" coordsize="4816,2272" o:gfxdata="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">
                       <o:lock v:ext="edit" aspectratio="f"/>
                       <v:group id="组合 6" o:spid="_x0000_s1026" o:spt="203" style="position:absolute;left:19211;top:18842;height:2273;width:4816;" coordorigin="19199,18902" coordsize="4816,2273" o:gfxdata="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">
                         <o:lock v:ext="edit" aspectratio="f"/>
@@ -4523,11 +4720,11 @@
       <w:bookmarkStart w:id="2" w:name="_Toc12505"/>
       <w:bookmarkStart w:id="3" w:name="_Toc27302"/>
       <w:bookmarkStart w:id="4" w:name="_Toc2409"/>
-      <w:bookmarkStart w:id="5" w:name="_Toc28240"/>
-      <w:bookmarkStart w:id="6" w:name="_Toc22658"/>
-      <w:bookmarkStart w:id="7" w:name="_Toc1707_WPSOffice_Level1"/>
-      <w:bookmarkStart w:id="8" w:name="_Toc21764_WPSOffice_Level1"/>
-      <w:bookmarkStart w:id="9" w:name="_Toc13196_WPSOffice_Level1"/>
+      <w:bookmarkStart w:id="5" w:name="_Toc1707_WPSOffice_Level1"/>
+      <w:bookmarkStart w:id="6" w:name="_Toc28240"/>
+      <w:bookmarkStart w:id="7" w:name="_Toc21764_WPSOffice_Level1"/>
+      <w:bookmarkStart w:id="8" w:name="_Toc13196_WPSOffice_Level1"/>
+      <w:bookmarkStart w:id="9" w:name="_Toc22658"/>
       <w:r>
         <w:rPr>
           <w:rFonts w:ascii="宋体" w:hAnsi="宋体" w:eastAsia="宋体" w:cs="宋体"/>
@@ -4681,7 +4878,59 @@
           <w:sz w:val="24"/>
           <w:szCs w:val="24"/>
         </w:rPr>
-        <w:t xml:space="preserve">tdd.ori_variant  </w:t>
+        <w:t xml:space="preserve">tdd.ori_variant </w:t>
+      </w:r>
+      <w:r>
+        <w:rPr>
+          <w:rFonts w:hint="eastAsia" w:ascii="宋体" w:hAnsi="宋体" w:eastAsia="宋体" w:cs="宋体"/>
+          <w:sz w:val="24"/>
+          <w:szCs w:val="24"/>
+          <w:lang w:val="en-US" w:eastAsia="zh-CN"/>
+        </w:rPr>
+        <w:t xml:space="preserve">or </w:t>
+      </w:r>
+      <w:r>
+        <w:rPr>
+          <w:rFonts w:hint="default" w:ascii="宋体" w:hAnsi="宋体" w:eastAsia="宋体" w:cs="宋体"/>
+          <w:sz w:val="24"/>
+          <w:szCs w:val="24"/>
+          <w:lang w:val="en-US" w:eastAsia="zh-CN"/>
+        </w:rPr>
+        <w:t>‘</w:t>
+      </w:r>
+      <w:r>
+        <w:rPr>
+          <w:rFonts w:ascii="宋体" w:hAnsi="宋体" w:eastAsia="宋体" w:cs="宋体"/>
+          <w:sz w:val="24"/>
+          <w:szCs w:val="24"/>
+        </w:rPr>
+        <w:t>C797S</w:t>
+      </w:r>
+      <w:r>
+        <w:rPr>
+          <w:rFonts w:hint="default" w:ascii="宋体" w:hAnsi="宋体" w:eastAsia="宋体" w:cs="宋体"/>
+          <w:sz w:val="24"/>
+          <w:szCs w:val="24"/>
+          <w:lang w:val="en-US" w:eastAsia="zh-CN"/>
+        </w:rPr>
+        <w:t>’</w:t>
+      </w:r>
+      <w:r>
+        <w:rPr>
+          <w:rFonts w:hint="eastAsia" w:ascii="宋体" w:hAnsi="宋体" w:eastAsia="宋体" w:cs="宋体"/>
+          <w:sz w:val="24"/>
+          <w:szCs w:val="24"/>
+          <w:lang w:val="en-US" w:eastAsia="zh-CN"/>
+        </w:rPr>
+        <w:t xml:space="preserve">in </w:t>
+      </w:r>
+      <w:r>
+        <w:rPr>
+          <w:rFonts w:ascii="宋体" w:hAnsi="宋体" w:eastAsia="宋体" w:cs="宋体"/>
+          <w:sz w:val="24"/>
+          <w:szCs w:val="24"/>
+        </w:rPr>
+        <w:t xml:space="preserve">tdd.ori_variant </w:t>
       </w:r>
       <w:r>
         <w:rPr>
@@ -4985,7 +5234,69 @@
           <w:sz w:val="24"/>
           <w:szCs w:val="24"/>
         </w:rPr>
-        <w:t xml:space="preserve">tdd.ori_variant  </w:t>
+        <w:t xml:space="preserve">tdd.ori_variant </w:t>
+      </w:r>
+      <w:r>
+        <w:rPr>
+          <w:rFonts w:hint="eastAsia" w:ascii="宋体" w:hAnsi="宋体" w:eastAsia="宋体" w:cs="宋体"/>
+          <w:sz w:val="24"/>
+          <w:szCs w:val="24"/>
+          <w:lang w:val="en-US" w:eastAsia="zh-CN"/>
+        </w:rPr>
+        <w:t xml:space="preserve">or </w:t>
+      </w:r>
+      <w:r>
+        <w:rPr>
+          <w:rFonts w:hint="default" w:ascii="宋体" w:hAnsi="宋体" w:eastAsia="宋体" w:cs="宋体"/>
+          <w:sz w:val="24"/>
+          <w:szCs w:val="24"/>
+          <w:lang w:val="en-US" w:eastAsia="zh-CN"/>
+        </w:rPr>
+        <w:t>‘</w:t>
+      </w:r>
+      <w:r>
+        <w:rPr>
+          <w:rFonts w:ascii="宋体" w:hAnsi="宋体" w:eastAsia="宋体" w:cs="宋体"/>
+          <w:sz w:val="24"/>
+          <w:szCs w:val="24"/>
+        </w:rPr>
+        <w:t>C797S</w:t>
+      </w:r>
+      <w:r>
+        <w:rPr>
+          <w:rFonts w:hint="default" w:ascii="宋体" w:hAnsi="宋体" w:eastAsia="宋体" w:cs="宋体"/>
+          <w:sz w:val="24"/>
+          <w:szCs w:val="24"/>
+          <w:lang w:val="en-US" w:eastAsia="zh-CN"/>
+        </w:rPr>
+        <w:t>’</w:t>
+      </w:r>
+      <w:r>
+        <w:rPr>
+          <w:rFonts w:hint="eastAsia" w:ascii="宋体" w:hAnsi="宋体" w:eastAsia="宋体" w:cs="宋体"/>
+          <w:sz w:val="24"/>
+          <w:szCs w:val="24"/>
+          <w:lang w:val="en-US" w:eastAsia="zh-CN"/>
+        </w:rPr>
+        <w:t xml:space="preserve">in </w:t>
+      </w:r>
+      <w:r>
+        <w:rPr>
+          <w:rFonts w:ascii="宋体" w:hAnsi="宋体" w:eastAsia="宋体" w:cs="宋体"/>
+          <w:sz w:val="24"/>
+          <w:szCs w:val="24"/>
+        </w:rPr>
+        <w:t>tdd.ori_variant</w:t>
+      </w:r>
+      <w:bookmarkStart w:id="11" w:name="_GoBack"/>
+      <w:bookmarkEnd w:id="11"/>
+      <w:r>
+        <w:rPr>
+          <w:rFonts w:ascii="宋体" w:hAnsi="宋体" w:eastAsia="宋体" w:cs="宋体"/>
+          <w:sz w:val="24"/>
+          <w:szCs w:val="24"/>
+        </w:rPr>
+        <w:t xml:space="preserve"> </w:t>
       </w:r>
       <w:r>
         <w:rPr>
@@ -9383,7 +9694,6 @@
       <w:bookmarkEnd w:id="7"/>
       <w:bookmarkEnd w:id="8"/>
       <w:bookmarkEnd w:id="9"/>
-      <w:bookmarkStart w:id="11" w:name="_GoBack"/>
       <w:r>
         <w:rPr>
           <w:rFonts w:ascii="Times New Roman" w:hAnsi="Times New Roman" w:eastAsia="微软雅黑" w:cs="黑体"/>
@@ -9401,7 +9711,6 @@
         </w:rPr>
         <w:t>附录</w:t>
       </w:r>
-      <w:bookmarkEnd w:id="11"/>
     </w:p>
     <w:p>
       <w:pPr>

</xml_diff>